<commit_message>
border bill = 0
</commit_message>
<xml_diff>
--- a/public/receipt-template.docx
+++ b/public/receipt-template.docx
@@ -20,6 +20,7 @@
       </w:tblGrid>
       <w:tr>
         <w:trPr>
+          <w:trHeight w:val="6570" w:hRule="atLeast"/>
           <w:cantSplit/>
         </w:trPr>
         <w:tc>
@@ -437,7 +438,7 @@
           </w:p>
           <w:tbl>
             <w:tblPr>
-              <w:tblW w:w="4180" w:type="dxa"/>
+              <w:tblW w:w="4290" w:type="dxa"/>
               <w:jc w:val="start"/>
               <w:tblInd w:w="0" w:type="dxa"/>
               <w:tblLayout w:type="fixed"/>
@@ -449,8 +450,8 @@
               </w:tblCellMar>
             </w:tblPr>
             <w:tblGrid>
-              <w:gridCol w:w="2609"/>
-              <w:gridCol w:w="1571"/>
+              <w:gridCol w:w="2580"/>
+              <w:gridCol w:w="1710"/>
             </w:tblGrid>
             <w:tr>
               <w:trPr>
@@ -459,7 +460,7 @@
               </w:trPr>
               <w:tc>
                 <w:tcPr>
-                  <w:tcW w:w="2609" w:type="dxa"/>
+                  <w:tcW w:w="2580" w:type="dxa"/>
                   <w:tcBorders>
                     <w:top w:val="single" w:sz="2" w:space="0" w:color="DDE3D5"/>
                     <w:start w:val="single" w:sz="2" w:space="0" w:color="DDE3D5"/>
@@ -545,7 +546,7 @@
               </w:tc>
               <w:tc>
                 <w:tcPr>
-                  <w:tcW w:w="1571" w:type="dxa"/>
+                  <w:tcW w:w="1710" w:type="dxa"/>
                   <w:tcBorders>
                     <w:top w:val="single" w:sz="2" w:space="0" w:color="DDE3D5"/>
                     <w:bottom w:val="single" w:sz="2" w:space="0" w:color="DDE3D5"/>

</xml_diff>